<commit_message>
feat: Adiciona coluna beneficio_social
</commit_message>
<xml_diff>
--- a/Campos das tabelas do banco de dados.docx
+++ b/Campos das tabelas do banco de dados.docx
@@ -55,19 +55,11 @@
           <w:rFonts w:ascii="Arial" w:hAnsi="Arial" w:cs="Arial"/>
         </w:rPr>
       </w:pPr>
-      <w:proofErr w:type="spellStart"/>
-      <w:r>
-        <w:rPr>
-          <w:rFonts w:ascii="Arial" w:hAnsi="Arial" w:cs="Arial"/>
-        </w:rPr>
-        <w:t>banco_talentos</w:t>
-      </w:r>
-      <w:proofErr w:type="spellEnd"/>
-      <w:r>
-        <w:rPr>
-          <w:rFonts w:ascii="Arial" w:hAnsi="Arial" w:cs="Arial"/>
-        </w:rPr>
-        <w:t>:</w:t>
+      <w:r>
+        <w:rPr>
+          <w:rFonts w:ascii="Arial" w:hAnsi="Arial" w:cs="Arial"/>
+        </w:rPr>
+        <w:t>banco_talentos:</w:t>
       </w:r>
     </w:p>
     <w:p>
@@ -105,190 +97,102 @@
         <w:rPr>
           <w:rFonts w:ascii="Arial" w:hAnsi="Arial" w:cs="Arial"/>
         </w:rPr>
-        <w:t xml:space="preserve">nome – </w:t>
-      </w:r>
-      <w:proofErr w:type="spellStart"/>
-      <w:r>
-        <w:rPr>
-          <w:rFonts w:ascii="Arial" w:hAnsi="Arial" w:cs="Arial"/>
-        </w:rPr>
-        <w:t>caracter</w:t>
-      </w:r>
-      <w:proofErr w:type="spellEnd"/>
-      <w:r>
-        <w:rPr>
-          <w:rFonts w:ascii="Arial" w:hAnsi="Arial" w:cs="Arial"/>
-        </w:rPr>
-        <w:t xml:space="preserve"> (255)</w:t>
-      </w:r>
-    </w:p>
-    <w:p>
-      <w:pPr>
-        <w:pStyle w:val="PargrafodaLista"/>
-        <w:numPr>
-          <w:ilvl w:val="0"/>
-          <w:numId w:val="2"/>
-        </w:numPr>
-        <w:jc w:val="both"/>
-        <w:rPr>
-          <w:rFonts w:ascii="Arial" w:hAnsi="Arial" w:cs="Arial"/>
-        </w:rPr>
-      </w:pPr>
-      <w:proofErr w:type="spellStart"/>
-      <w:r>
-        <w:rPr>
-          <w:rFonts w:ascii="Arial" w:hAnsi="Arial" w:cs="Arial"/>
-        </w:rPr>
-        <w:t>data_nascimento</w:t>
-      </w:r>
-      <w:proofErr w:type="spellEnd"/>
-      <w:r>
-        <w:rPr>
-          <w:rFonts w:ascii="Arial" w:hAnsi="Arial" w:cs="Arial"/>
-        </w:rPr>
-        <w:t xml:space="preserve"> – data</w:t>
-      </w:r>
-    </w:p>
-    <w:p>
-      <w:pPr>
-        <w:pStyle w:val="PargrafodaLista"/>
-        <w:numPr>
-          <w:ilvl w:val="0"/>
-          <w:numId w:val="2"/>
-        </w:numPr>
-        <w:jc w:val="both"/>
-        <w:rPr>
-          <w:rFonts w:ascii="Arial" w:hAnsi="Arial" w:cs="Arial"/>
-        </w:rPr>
-      </w:pPr>
-      <w:proofErr w:type="spellStart"/>
-      <w:r>
-        <w:rPr>
-          <w:rFonts w:ascii="Arial" w:hAnsi="Arial" w:cs="Arial"/>
-        </w:rPr>
-        <w:t>email</w:t>
-      </w:r>
-      <w:proofErr w:type="spellEnd"/>
-      <w:r>
-        <w:rPr>
-          <w:rFonts w:ascii="Arial" w:hAnsi="Arial" w:cs="Arial"/>
-        </w:rPr>
-        <w:t xml:space="preserve"> – </w:t>
-      </w:r>
-      <w:proofErr w:type="spellStart"/>
-      <w:r>
-        <w:rPr>
-          <w:rFonts w:ascii="Arial" w:hAnsi="Arial" w:cs="Arial"/>
-        </w:rPr>
-        <w:t>caracter</w:t>
-      </w:r>
-      <w:proofErr w:type="spellEnd"/>
-      <w:r>
-        <w:rPr>
-          <w:rFonts w:ascii="Arial" w:hAnsi="Arial" w:cs="Arial"/>
-        </w:rPr>
-        <w:t xml:space="preserve"> (190)</w:t>
-      </w:r>
-    </w:p>
-    <w:p>
-      <w:pPr>
-        <w:pStyle w:val="PargrafodaLista"/>
-        <w:numPr>
-          <w:ilvl w:val="0"/>
-          <w:numId w:val="2"/>
-        </w:numPr>
-        <w:jc w:val="both"/>
-        <w:rPr>
-          <w:rFonts w:ascii="Arial" w:hAnsi="Arial" w:cs="Arial"/>
-        </w:rPr>
-      </w:pPr>
-      <w:r>
-        <w:rPr>
-          <w:rFonts w:ascii="Arial" w:hAnsi="Arial" w:cs="Arial"/>
-        </w:rPr>
-        <w:t xml:space="preserve">telefone – </w:t>
-      </w:r>
-      <w:proofErr w:type="spellStart"/>
-      <w:r>
-        <w:rPr>
-          <w:rFonts w:ascii="Arial" w:hAnsi="Arial" w:cs="Arial"/>
-        </w:rPr>
-        <w:t>caracter</w:t>
-      </w:r>
-      <w:proofErr w:type="spellEnd"/>
-      <w:r>
-        <w:rPr>
-          <w:rFonts w:ascii="Arial" w:hAnsi="Arial" w:cs="Arial"/>
-        </w:rPr>
-        <w:t xml:space="preserve"> (20)</w:t>
-      </w:r>
-    </w:p>
-    <w:p>
-      <w:pPr>
-        <w:pStyle w:val="PargrafodaLista"/>
-        <w:numPr>
-          <w:ilvl w:val="0"/>
-          <w:numId w:val="2"/>
-        </w:numPr>
-        <w:jc w:val="both"/>
-        <w:rPr>
-          <w:rFonts w:ascii="Arial" w:hAnsi="Arial" w:cs="Arial"/>
-        </w:rPr>
-      </w:pPr>
-      <w:proofErr w:type="spellStart"/>
-      <w:r>
-        <w:rPr>
-          <w:rFonts w:ascii="Arial" w:hAnsi="Arial" w:cs="Arial"/>
-        </w:rPr>
-        <w:t>cpf</w:t>
-      </w:r>
-      <w:proofErr w:type="spellEnd"/>
-      <w:r>
-        <w:rPr>
-          <w:rFonts w:ascii="Arial" w:hAnsi="Arial" w:cs="Arial"/>
-        </w:rPr>
-        <w:t xml:space="preserve"> – </w:t>
-      </w:r>
-      <w:proofErr w:type="spellStart"/>
-      <w:r>
-        <w:rPr>
-          <w:rFonts w:ascii="Arial" w:hAnsi="Arial" w:cs="Arial"/>
-        </w:rPr>
-        <w:t>caracter</w:t>
-      </w:r>
-      <w:proofErr w:type="spellEnd"/>
-      <w:r>
-        <w:rPr>
-          <w:rFonts w:ascii="Arial" w:hAnsi="Arial" w:cs="Arial"/>
-        </w:rPr>
-        <w:t xml:space="preserve"> (14)</w:t>
-      </w:r>
-    </w:p>
-    <w:p>
-      <w:pPr>
-        <w:pStyle w:val="PargrafodaLista"/>
-        <w:numPr>
-          <w:ilvl w:val="0"/>
-          <w:numId w:val="2"/>
-        </w:numPr>
-        <w:jc w:val="both"/>
-        <w:rPr>
-          <w:rFonts w:ascii="Arial" w:hAnsi="Arial" w:cs="Arial"/>
-        </w:rPr>
-      </w:pPr>
-      <w:proofErr w:type="spellStart"/>
-      <w:r>
-        <w:rPr>
-          <w:rFonts w:ascii="Arial" w:hAnsi="Arial" w:cs="Arial"/>
-        </w:rPr>
-        <w:t>renda_mesal</w:t>
-      </w:r>
-      <w:proofErr w:type="spellEnd"/>
-      <w:r>
-        <w:rPr>
-          <w:rFonts w:ascii="Arial" w:hAnsi="Arial" w:cs="Arial"/>
-        </w:rPr>
-        <w:t xml:space="preserve"> – decimal (12,2)</w:t>
+        <w:t>nome – caracter (255)</w:t>
+      </w:r>
+    </w:p>
+    <w:p>
+      <w:pPr>
+        <w:pStyle w:val="PargrafodaLista"/>
+        <w:numPr>
+          <w:ilvl w:val="0"/>
+          <w:numId w:val="2"/>
+        </w:numPr>
+        <w:jc w:val="both"/>
+        <w:rPr>
+          <w:rFonts w:ascii="Arial" w:hAnsi="Arial" w:cs="Arial"/>
+        </w:rPr>
+      </w:pPr>
+      <w:r>
+        <w:rPr>
+          <w:rFonts w:ascii="Arial" w:hAnsi="Arial" w:cs="Arial"/>
+        </w:rPr>
+        <w:t>data_nascimento – data</w:t>
+      </w:r>
+    </w:p>
+    <w:p>
+      <w:pPr>
+        <w:pStyle w:val="PargrafodaLista"/>
+        <w:numPr>
+          <w:ilvl w:val="0"/>
+          <w:numId w:val="2"/>
+        </w:numPr>
+        <w:jc w:val="both"/>
+        <w:rPr>
+          <w:rFonts w:ascii="Arial" w:hAnsi="Arial" w:cs="Arial"/>
+        </w:rPr>
+      </w:pPr>
+      <w:r>
+        <w:rPr>
+          <w:rFonts w:ascii="Arial" w:hAnsi="Arial" w:cs="Arial"/>
+        </w:rPr>
+        <w:t>email – caracter (190)</w:t>
+      </w:r>
+    </w:p>
+    <w:p>
+      <w:pPr>
+        <w:pStyle w:val="PargrafodaLista"/>
+        <w:numPr>
+          <w:ilvl w:val="0"/>
+          <w:numId w:val="2"/>
+        </w:numPr>
+        <w:jc w:val="both"/>
+        <w:rPr>
+          <w:rFonts w:ascii="Arial" w:hAnsi="Arial" w:cs="Arial"/>
+        </w:rPr>
+      </w:pPr>
+      <w:r>
+        <w:rPr>
+          <w:rFonts w:ascii="Arial" w:hAnsi="Arial" w:cs="Arial"/>
+        </w:rPr>
+        <w:t>telefone – caracter (20)</w:t>
+      </w:r>
+    </w:p>
+    <w:p>
+      <w:pPr>
+        <w:pStyle w:val="PargrafodaLista"/>
+        <w:numPr>
+          <w:ilvl w:val="0"/>
+          <w:numId w:val="2"/>
+        </w:numPr>
+        <w:jc w:val="both"/>
+        <w:rPr>
+          <w:rFonts w:ascii="Arial" w:hAnsi="Arial" w:cs="Arial"/>
+        </w:rPr>
+      </w:pPr>
+      <w:r>
+        <w:rPr>
+          <w:rFonts w:ascii="Arial" w:hAnsi="Arial" w:cs="Arial"/>
+        </w:rPr>
+        <w:t>cpf – caracter (14)</w:t>
+      </w:r>
+    </w:p>
+    <w:p>
+      <w:pPr>
+        <w:pStyle w:val="PargrafodaLista"/>
+        <w:numPr>
+          <w:ilvl w:val="0"/>
+          <w:numId w:val="2"/>
+        </w:numPr>
+        <w:jc w:val="both"/>
+        <w:rPr>
+          <w:rFonts w:ascii="Arial" w:hAnsi="Arial" w:cs="Arial"/>
+        </w:rPr>
+      </w:pPr>
+      <w:r>
+        <w:rPr>
+          <w:rFonts w:ascii="Arial" w:hAnsi="Arial" w:cs="Arial"/>
+        </w:rPr>
+        <w:t>renda_mesal – decimal (12,2)</w:t>
       </w:r>
     </w:p>
     <w:p>
@@ -328,87 +232,49 @@
           <w:rFonts w:ascii="Arial" w:hAnsi="Arial" w:cs="Arial"/>
         </w:rPr>
       </w:pPr>
-      <w:proofErr w:type="spellStart"/>
-      <w:r>
-        <w:rPr>
-          <w:rFonts w:ascii="Arial" w:hAnsi="Arial" w:cs="Arial"/>
-        </w:rPr>
-        <w:t>cor_raca</w:t>
-      </w:r>
-      <w:proofErr w:type="spellEnd"/>
-      <w:r>
-        <w:rPr>
-          <w:rFonts w:ascii="Arial" w:hAnsi="Arial" w:cs="Arial"/>
-        </w:rPr>
-        <w:t xml:space="preserve"> – (Branco, Pardo, Preto, Amarelo, Indígena)</w:t>
-      </w:r>
-    </w:p>
-    <w:p>
-      <w:pPr>
-        <w:pStyle w:val="PargrafodaLista"/>
-        <w:numPr>
-          <w:ilvl w:val="0"/>
-          <w:numId w:val="2"/>
-        </w:numPr>
-        <w:jc w:val="both"/>
-        <w:rPr>
-          <w:rFonts w:ascii="Arial" w:hAnsi="Arial" w:cs="Arial"/>
-        </w:rPr>
-      </w:pPr>
-      <w:proofErr w:type="spellStart"/>
-      <w:r>
-        <w:rPr>
-          <w:rFonts w:ascii="Arial" w:hAnsi="Arial" w:cs="Arial"/>
-        </w:rPr>
-        <w:t>estado_civil</w:t>
-      </w:r>
-      <w:proofErr w:type="spellEnd"/>
-      <w:r>
-        <w:rPr>
-          <w:rFonts w:ascii="Arial" w:hAnsi="Arial" w:cs="Arial"/>
-        </w:rPr>
-        <w:t xml:space="preserve"> – (Solteiro, Casado, Separado, Divorciado, Viúvo)</w:t>
-      </w:r>
-    </w:p>
-    <w:p>
-      <w:pPr>
-        <w:pStyle w:val="PargrafodaLista"/>
-        <w:numPr>
-          <w:ilvl w:val="0"/>
-          <w:numId w:val="2"/>
-        </w:numPr>
-        <w:jc w:val="both"/>
-        <w:rPr>
-          <w:rFonts w:ascii="Arial" w:hAnsi="Arial" w:cs="Arial"/>
-        </w:rPr>
-      </w:pPr>
-      <w:proofErr w:type="spellStart"/>
-      <w:r>
-        <w:rPr>
-          <w:rFonts w:ascii="Arial" w:hAnsi="Arial" w:cs="Arial"/>
-        </w:rPr>
-        <w:t>comunidade_tradicional</w:t>
-      </w:r>
-      <w:proofErr w:type="spellEnd"/>
-      <w:r>
-        <w:rPr>
-          <w:rFonts w:ascii="Arial" w:hAnsi="Arial" w:cs="Arial"/>
-        </w:rPr>
-        <w:t xml:space="preserve"> – (Povos Indígenas, Comunidade Quilombola, Povos de Terreiro, Povo Cigano, Pescador Artesanal, Marisqueiro, Ribeirinho, </w:t>
-      </w:r>
-      <w:proofErr w:type="spellStart"/>
-      <w:r>
-        <w:rPr>
-          <w:rFonts w:ascii="Arial" w:hAnsi="Arial" w:cs="Arial"/>
-        </w:rPr>
-        <w:t>Extravista</w:t>
-      </w:r>
-      <w:proofErr w:type="spellEnd"/>
-      <w:r>
-        <w:rPr>
-          <w:rFonts w:ascii="Arial" w:hAnsi="Arial" w:cs="Arial"/>
-        </w:rPr>
-        <w:t>, Catador de Material Reciclável, Outro)</w:t>
+      <w:r>
+        <w:rPr>
+          <w:rFonts w:ascii="Arial" w:hAnsi="Arial" w:cs="Arial"/>
+        </w:rPr>
+        <w:t>cor_raca – (Branco, Pardo, Preto, Amarelo, Indígena)</w:t>
+      </w:r>
+    </w:p>
+    <w:p>
+      <w:pPr>
+        <w:pStyle w:val="PargrafodaLista"/>
+        <w:numPr>
+          <w:ilvl w:val="0"/>
+          <w:numId w:val="2"/>
+        </w:numPr>
+        <w:jc w:val="both"/>
+        <w:rPr>
+          <w:rFonts w:ascii="Arial" w:hAnsi="Arial" w:cs="Arial"/>
+        </w:rPr>
+      </w:pPr>
+      <w:r>
+        <w:rPr>
+          <w:rFonts w:ascii="Arial" w:hAnsi="Arial" w:cs="Arial"/>
+        </w:rPr>
+        <w:t>estado_civil – (Solteiro, Casado, Separado, Divorciado, Viúvo)</w:t>
+      </w:r>
+    </w:p>
+    <w:p>
+      <w:pPr>
+        <w:pStyle w:val="PargrafodaLista"/>
+        <w:numPr>
+          <w:ilvl w:val="0"/>
+          <w:numId w:val="2"/>
+        </w:numPr>
+        <w:jc w:val="both"/>
+        <w:rPr>
+          <w:rFonts w:ascii="Arial" w:hAnsi="Arial" w:cs="Arial"/>
+        </w:rPr>
+      </w:pPr>
+      <w:r>
+        <w:rPr>
+          <w:rFonts w:ascii="Arial" w:hAnsi="Arial" w:cs="Arial"/>
+        </w:rPr>
+        <w:t>comunidade_tradicional – (Povos Indígenas, Comunidade Quilombola, Povos de Terreiro, Povo Cigano, Pescador Artesanal, Marisqueiro, Ribeirinho, Extravista, Catador de Material Reciclável, Outro)</w:t>
       </w:r>
     </w:p>
     <w:p>
@@ -465,48 +331,26 @@
         <w:rPr>
           <w:rFonts w:ascii="Arial" w:hAnsi="Arial" w:cs="Arial"/>
         </w:rPr>
-        <w:t xml:space="preserve">empreendimento – </w:t>
-      </w:r>
-      <w:proofErr w:type="spellStart"/>
-      <w:r>
-        <w:rPr>
-          <w:rFonts w:ascii="Arial" w:hAnsi="Arial" w:cs="Arial"/>
-        </w:rPr>
-        <w:t>caracter</w:t>
-      </w:r>
-      <w:proofErr w:type="spellEnd"/>
-      <w:r>
-        <w:rPr>
-          <w:rFonts w:ascii="Arial" w:hAnsi="Arial" w:cs="Arial"/>
-        </w:rPr>
-        <w:t xml:space="preserve"> (255)</w:t>
-      </w:r>
-    </w:p>
-    <w:p>
-      <w:pPr>
-        <w:pStyle w:val="PargrafodaLista"/>
-        <w:numPr>
-          <w:ilvl w:val="0"/>
-          <w:numId w:val="2"/>
-        </w:numPr>
-        <w:jc w:val="both"/>
-        <w:rPr>
-          <w:rFonts w:ascii="Arial" w:hAnsi="Arial" w:cs="Arial"/>
-        </w:rPr>
-      </w:pPr>
-      <w:proofErr w:type="spellStart"/>
-      <w:r>
-        <w:rPr>
-          <w:rFonts w:ascii="Arial" w:hAnsi="Arial" w:cs="Arial"/>
-        </w:rPr>
-        <w:t>empresa_regularizada</w:t>
-      </w:r>
-      <w:proofErr w:type="spellEnd"/>
-      <w:r>
-        <w:rPr>
-          <w:rFonts w:ascii="Arial" w:hAnsi="Arial" w:cs="Arial"/>
-        </w:rPr>
-        <w:t xml:space="preserve"> – </w:t>
+        <w:t>empreendimento – caracter (255)</w:t>
+      </w:r>
+    </w:p>
+    <w:p>
+      <w:pPr>
+        <w:pStyle w:val="PargrafodaLista"/>
+        <w:numPr>
+          <w:ilvl w:val="0"/>
+          <w:numId w:val="2"/>
+        </w:numPr>
+        <w:jc w:val="both"/>
+        <w:rPr>
+          <w:rFonts w:ascii="Arial" w:hAnsi="Arial" w:cs="Arial"/>
+        </w:rPr>
+      </w:pPr>
+      <w:r>
+        <w:rPr>
+          <w:rFonts w:ascii="Arial" w:hAnsi="Arial" w:cs="Arial"/>
+        </w:rPr>
+        <w:t xml:space="preserve">empresa_regularizada – </w:t>
       </w:r>
       <w:r>
         <w:rPr>
@@ -533,101 +377,49 @@
           <w:rFonts w:ascii="Arial" w:hAnsi="Arial" w:cs="Arial"/>
         </w:rPr>
       </w:pPr>
-      <w:proofErr w:type="spellStart"/>
-      <w:r>
-        <w:rPr>
-          <w:rFonts w:ascii="Arial" w:hAnsi="Arial" w:cs="Arial"/>
-        </w:rPr>
-        <w:t>cnpj</w:t>
-      </w:r>
-      <w:proofErr w:type="spellEnd"/>
-      <w:r>
-        <w:rPr>
-          <w:rFonts w:ascii="Arial" w:hAnsi="Arial" w:cs="Arial"/>
-        </w:rPr>
-        <w:t xml:space="preserve"> – </w:t>
-      </w:r>
-      <w:proofErr w:type="spellStart"/>
-      <w:r>
-        <w:rPr>
-          <w:rFonts w:ascii="Arial" w:hAnsi="Arial" w:cs="Arial"/>
-        </w:rPr>
-        <w:t>caracter</w:t>
-      </w:r>
-      <w:proofErr w:type="spellEnd"/>
-      <w:r>
-        <w:rPr>
-          <w:rFonts w:ascii="Arial" w:hAnsi="Arial" w:cs="Arial"/>
-        </w:rPr>
-        <w:t xml:space="preserve"> (18)</w:t>
-      </w:r>
-    </w:p>
-    <w:p>
-      <w:pPr>
-        <w:pStyle w:val="PargrafodaLista"/>
-        <w:numPr>
-          <w:ilvl w:val="0"/>
-          <w:numId w:val="2"/>
-        </w:numPr>
-        <w:jc w:val="both"/>
-        <w:rPr>
-          <w:rFonts w:ascii="Arial" w:hAnsi="Arial" w:cs="Arial"/>
-        </w:rPr>
-      </w:pPr>
-      <w:proofErr w:type="spellStart"/>
-      <w:r>
-        <w:rPr>
-          <w:rFonts w:ascii="Arial" w:hAnsi="Arial" w:cs="Arial"/>
-        </w:rPr>
-        <w:t>segmento_atuacao</w:t>
-      </w:r>
-      <w:proofErr w:type="spellEnd"/>
-      <w:r>
-        <w:rPr>
-          <w:rFonts w:ascii="Arial" w:hAnsi="Arial" w:cs="Arial"/>
-        </w:rPr>
-        <w:t xml:space="preserve"> – </w:t>
-      </w:r>
-      <w:proofErr w:type="spellStart"/>
-      <w:r>
-        <w:rPr>
-          <w:rFonts w:ascii="Arial" w:hAnsi="Arial" w:cs="Arial"/>
-        </w:rPr>
-        <w:t>caracter</w:t>
-      </w:r>
-      <w:proofErr w:type="spellEnd"/>
-      <w:r>
-        <w:rPr>
-          <w:rFonts w:ascii="Arial" w:hAnsi="Arial" w:cs="Arial"/>
-        </w:rPr>
-        <w:t xml:space="preserve"> (50)</w:t>
-      </w:r>
-    </w:p>
-    <w:p>
-      <w:pPr>
-        <w:pStyle w:val="PargrafodaLista"/>
-        <w:numPr>
-          <w:ilvl w:val="0"/>
-          <w:numId w:val="2"/>
-        </w:numPr>
-        <w:jc w:val="both"/>
-        <w:rPr>
-          <w:rFonts w:ascii="Arial" w:hAnsi="Arial" w:cs="Arial"/>
-        </w:rPr>
-      </w:pPr>
-      <w:proofErr w:type="spellStart"/>
-      <w:r>
-        <w:rPr>
-          <w:rFonts w:ascii="Arial" w:hAnsi="Arial" w:cs="Arial"/>
-        </w:rPr>
-        <w:t>empreende_sozinho</w:t>
-      </w:r>
-      <w:proofErr w:type="spellEnd"/>
-      <w:r>
-        <w:rPr>
-          <w:rFonts w:ascii="Arial" w:hAnsi="Arial" w:cs="Arial"/>
-        </w:rPr>
-        <w:t xml:space="preserve"> –</w:t>
+      <w:r>
+        <w:rPr>
+          <w:rFonts w:ascii="Arial" w:hAnsi="Arial" w:cs="Arial"/>
+        </w:rPr>
+        <w:t>cnpj – caracter (18)</w:t>
+      </w:r>
+    </w:p>
+    <w:p>
+      <w:pPr>
+        <w:pStyle w:val="PargrafodaLista"/>
+        <w:numPr>
+          <w:ilvl w:val="0"/>
+          <w:numId w:val="2"/>
+        </w:numPr>
+        <w:jc w:val="both"/>
+        <w:rPr>
+          <w:rFonts w:ascii="Arial" w:hAnsi="Arial" w:cs="Arial"/>
+        </w:rPr>
+      </w:pPr>
+      <w:r>
+        <w:rPr>
+          <w:rFonts w:ascii="Arial" w:hAnsi="Arial" w:cs="Arial"/>
+        </w:rPr>
+        <w:t>segmento_atuacao – caracter (50)</w:t>
+      </w:r>
+    </w:p>
+    <w:p>
+      <w:pPr>
+        <w:pStyle w:val="PargrafodaLista"/>
+        <w:numPr>
+          <w:ilvl w:val="0"/>
+          <w:numId w:val="2"/>
+        </w:numPr>
+        <w:jc w:val="both"/>
+        <w:rPr>
+          <w:rFonts w:ascii="Arial" w:hAnsi="Arial" w:cs="Arial"/>
+        </w:rPr>
+      </w:pPr>
+      <w:r>
+        <w:rPr>
+          <w:rFonts w:ascii="Arial" w:hAnsi="Arial" w:cs="Arial"/>
+        </w:rPr>
+        <w:t>empreende_sozinho –</w:t>
       </w:r>
       <w:r>
         <w:rPr>
@@ -654,155 +446,87 @@
           <w:rFonts w:ascii="Arial" w:hAnsi="Arial" w:cs="Arial"/>
         </w:rPr>
       </w:pPr>
-      <w:proofErr w:type="spellStart"/>
-      <w:r>
-        <w:rPr>
-          <w:rFonts w:ascii="Arial" w:hAnsi="Arial" w:cs="Arial"/>
-        </w:rPr>
-        <w:t>descrição_empreendimento</w:t>
-      </w:r>
-      <w:proofErr w:type="spellEnd"/>
-      <w:r>
-        <w:rPr>
-          <w:rFonts w:ascii="Arial" w:hAnsi="Arial" w:cs="Arial"/>
-        </w:rPr>
-        <w:t xml:space="preserve"> – texto</w:t>
-      </w:r>
-    </w:p>
-    <w:p>
-      <w:pPr>
-        <w:pStyle w:val="PargrafodaLista"/>
-        <w:numPr>
-          <w:ilvl w:val="0"/>
-          <w:numId w:val="2"/>
-        </w:numPr>
-        <w:jc w:val="both"/>
-        <w:rPr>
-          <w:rFonts w:ascii="Arial" w:hAnsi="Arial" w:cs="Arial"/>
-        </w:rPr>
-      </w:pPr>
-      <w:proofErr w:type="spellStart"/>
-      <w:r>
-        <w:rPr>
-          <w:rFonts w:ascii="Arial" w:hAnsi="Arial" w:cs="Arial"/>
-        </w:rPr>
-        <w:t>tipo_producao</w:t>
-      </w:r>
-      <w:proofErr w:type="spellEnd"/>
-      <w:r>
-        <w:rPr>
-          <w:rFonts w:ascii="Arial" w:hAnsi="Arial" w:cs="Arial"/>
-        </w:rPr>
-        <w:t xml:space="preserve"> – </w:t>
-      </w:r>
-      <w:proofErr w:type="spellStart"/>
-      <w:r>
-        <w:rPr>
-          <w:rFonts w:ascii="Arial" w:hAnsi="Arial" w:cs="Arial"/>
-        </w:rPr>
-        <w:t>caracter</w:t>
-      </w:r>
-      <w:proofErr w:type="spellEnd"/>
-      <w:r>
-        <w:rPr>
-          <w:rFonts w:ascii="Arial" w:hAnsi="Arial" w:cs="Arial"/>
-        </w:rPr>
-        <w:t xml:space="preserve"> (255)</w:t>
-      </w:r>
-    </w:p>
-    <w:p>
-      <w:pPr>
-        <w:pStyle w:val="PargrafodaLista"/>
-        <w:numPr>
-          <w:ilvl w:val="0"/>
-          <w:numId w:val="2"/>
-        </w:numPr>
-        <w:jc w:val="both"/>
-        <w:rPr>
-          <w:rFonts w:ascii="Arial" w:hAnsi="Arial" w:cs="Arial"/>
-        </w:rPr>
-      </w:pPr>
-      <w:proofErr w:type="spellStart"/>
-      <w:r>
-        <w:rPr>
-          <w:rFonts w:ascii="Arial" w:hAnsi="Arial" w:cs="Arial"/>
-        </w:rPr>
-        <w:t>instagram</w:t>
-      </w:r>
-      <w:proofErr w:type="spellEnd"/>
-      <w:r>
-        <w:rPr>
-          <w:rFonts w:ascii="Arial" w:hAnsi="Arial" w:cs="Arial"/>
-        </w:rPr>
-        <w:t xml:space="preserve"> – </w:t>
-      </w:r>
-      <w:proofErr w:type="spellStart"/>
-      <w:r>
-        <w:rPr>
-          <w:rFonts w:ascii="Arial" w:hAnsi="Arial" w:cs="Arial"/>
-        </w:rPr>
-        <w:t>caracter</w:t>
-      </w:r>
-      <w:proofErr w:type="spellEnd"/>
-      <w:r>
-        <w:rPr>
-          <w:rFonts w:ascii="Arial" w:hAnsi="Arial" w:cs="Arial"/>
-        </w:rPr>
-        <w:t xml:space="preserve"> (255)</w:t>
-      </w:r>
-    </w:p>
-    <w:p>
-      <w:pPr>
-        <w:pStyle w:val="PargrafodaLista"/>
-        <w:numPr>
-          <w:ilvl w:val="0"/>
-          <w:numId w:val="2"/>
-        </w:numPr>
-        <w:jc w:val="both"/>
-        <w:rPr>
-          <w:rFonts w:ascii="Arial" w:hAnsi="Arial" w:cs="Arial"/>
-        </w:rPr>
-      </w:pPr>
-      <w:proofErr w:type="spellStart"/>
-      <w:r>
-        <w:rPr>
-          <w:rFonts w:ascii="Arial" w:hAnsi="Arial" w:cs="Arial"/>
-        </w:rPr>
-        <w:t>ja_participou</w:t>
-      </w:r>
-      <w:proofErr w:type="spellEnd"/>
-      <w:r>
-        <w:rPr>
-          <w:rFonts w:ascii="Arial" w:hAnsi="Arial" w:cs="Arial"/>
-        </w:rPr>
-        <w:t xml:space="preserve"> – booleano (Sim/Não)</w:t>
-      </w:r>
-    </w:p>
-    <w:p>
-      <w:pPr>
-        <w:pStyle w:val="PargrafodaLista"/>
-        <w:numPr>
-          <w:ilvl w:val="0"/>
-          <w:numId w:val="2"/>
-        </w:numPr>
-        <w:jc w:val="both"/>
-        <w:rPr>
-          <w:rFonts w:ascii="Arial" w:hAnsi="Arial" w:cs="Arial"/>
-        </w:rPr>
-      </w:pPr>
-      <w:proofErr w:type="spellStart"/>
-      <w:r>
-        <w:rPr>
-          <w:rFonts w:ascii="Arial" w:hAnsi="Arial" w:cs="Arial"/>
-        </w:rPr>
-        <w:t>situação_profissional</w:t>
-      </w:r>
-      <w:proofErr w:type="spellEnd"/>
-      <w:r>
-        <w:rPr>
-          <w:rFonts w:ascii="Arial" w:hAnsi="Arial" w:cs="Arial"/>
-        </w:rPr>
-        <w:t xml:space="preserve"> – (Autônomo, </w:t>
+      <w:r>
+        <w:rPr>
+          <w:rFonts w:ascii="Arial" w:hAnsi="Arial" w:cs="Arial"/>
+        </w:rPr>
+        <w:t>descrição_empreendimento – texto</w:t>
+      </w:r>
+    </w:p>
+    <w:p>
+      <w:pPr>
+        <w:pStyle w:val="PargrafodaLista"/>
+        <w:numPr>
+          <w:ilvl w:val="0"/>
+          <w:numId w:val="2"/>
+        </w:numPr>
+        <w:jc w:val="both"/>
+        <w:rPr>
+          <w:rFonts w:ascii="Arial" w:hAnsi="Arial" w:cs="Arial"/>
+        </w:rPr>
+      </w:pPr>
+      <w:r>
+        <w:rPr>
+          <w:rFonts w:ascii="Arial" w:hAnsi="Arial" w:cs="Arial"/>
+        </w:rPr>
+        <w:t>tipo_producao – caracter (255)</w:t>
+      </w:r>
+    </w:p>
+    <w:p>
+      <w:pPr>
+        <w:pStyle w:val="PargrafodaLista"/>
+        <w:numPr>
+          <w:ilvl w:val="0"/>
+          <w:numId w:val="2"/>
+        </w:numPr>
+        <w:jc w:val="both"/>
+        <w:rPr>
+          <w:rFonts w:ascii="Arial" w:hAnsi="Arial" w:cs="Arial"/>
+        </w:rPr>
+      </w:pPr>
+      <w:r>
+        <w:rPr>
+          <w:rFonts w:ascii="Arial" w:hAnsi="Arial" w:cs="Arial"/>
+        </w:rPr>
+        <w:t>instagram – caracter (255)</w:t>
+      </w:r>
+    </w:p>
+    <w:p>
+      <w:pPr>
+        <w:pStyle w:val="PargrafodaLista"/>
+        <w:numPr>
+          <w:ilvl w:val="0"/>
+          <w:numId w:val="2"/>
+        </w:numPr>
+        <w:jc w:val="both"/>
+        <w:rPr>
+          <w:rFonts w:ascii="Arial" w:hAnsi="Arial" w:cs="Arial"/>
+        </w:rPr>
+      </w:pPr>
+      <w:r>
+        <w:rPr>
+          <w:rFonts w:ascii="Arial" w:hAnsi="Arial" w:cs="Arial"/>
+        </w:rPr>
+        <w:t>ja_participou – booleano (Sim/Não)</w:t>
+      </w:r>
+    </w:p>
+    <w:p>
+      <w:pPr>
+        <w:pStyle w:val="PargrafodaLista"/>
+        <w:numPr>
+          <w:ilvl w:val="0"/>
+          <w:numId w:val="2"/>
+        </w:numPr>
+        <w:jc w:val="both"/>
+        <w:rPr>
+          <w:rFonts w:ascii="Arial" w:hAnsi="Arial" w:cs="Arial"/>
+        </w:rPr>
+      </w:pPr>
+      <w:r>
+        <w:rPr>
+          <w:rFonts w:ascii="Arial" w:hAnsi="Arial" w:cs="Arial"/>
+        </w:rPr>
+        <w:t xml:space="preserve">situação_profissional – (Autônomo, </w:t>
       </w:r>
       <w:r>
         <w:rPr>
@@ -826,57 +550,92 @@
         <w:rPr>
           <w:rFonts w:ascii="Arial" w:hAnsi="Arial" w:cs="Arial"/>
         </w:rPr>
+        <w:t>, Assalariado no</w:t>
+      </w:r>
+      <w:r>
+        <w:rPr>
+          <w:rFonts w:ascii="Arial" w:hAnsi="Arial" w:cs="Arial"/>
+        </w:rPr>
+        <w:t xml:space="preserve"> setor p</w:t>
+      </w:r>
+      <w:r>
+        <w:rPr>
+          <w:rFonts w:ascii="Arial" w:hAnsi="Arial" w:cs="Arial"/>
+        </w:rPr>
+        <w:t xml:space="preserve">rivado, </w:t>
+      </w:r>
+      <w:r>
+        <w:rPr>
+          <w:rFonts w:ascii="Arial" w:hAnsi="Arial" w:cs="Arial"/>
+        </w:rPr>
+        <w:t>Aposentado/</w:t>
+      </w:r>
+      <w:r>
+        <w:rPr>
+          <w:rFonts w:ascii="Arial" w:hAnsi="Arial" w:cs="Arial"/>
+        </w:rPr>
+        <w:t>P</w:t>
+      </w:r>
+      <w:r>
+        <w:rPr>
+          <w:rFonts w:ascii="Arial" w:hAnsi="Arial" w:cs="Arial"/>
+        </w:rPr>
+        <w:t>ensionista</w:t>
+      </w:r>
+      <w:r>
+        <w:rPr>
+          <w:rFonts w:ascii="Arial" w:hAnsi="Arial" w:cs="Arial"/>
+        </w:rPr>
         <w:t xml:space="preserve">, </w:t>
       </w:r>
-      <w:proofErr w:type="gramStart"/>
-      <w:r>
-        <w:rPr>
-          <w:rFonts w:ascii="Arial" w:hAnsi="Arial" w:cs="Arial"/>
-        </w:rPr>
-        <w:t>Assalariado</w:t>
-      </w:r>
-      <w:proofErr w:type="gramEnd"/>
-      <w:r>
-        <w:rPr>
-          <w:rFonts w:ascii="Arial" w:hAnsi="Arial" w:cs="Arial"/>
-        </w:rPr>
-        <w:t xml:space="preserve"> </w:t>
-      </w:r>
-      <w:r>
-        <w:rPr>
-          <w:rFonts w:ascii="Arial" w:hAnsi="Arial" w:cs="Arial"/>
-        </w:rPr>
-        <w:t>no</w:t>
-      </w:r>
-      <w:r>
-        <w:rPr>
-          <w:rFonts w:ascii="Arial" w:hAnsi="Arial" w:cs="Arial"/>
-        </w:rPr>
-        <w:t xml:space="preserve"> setor p</w:t>
-      </w:r>
-      <w:r>
-        <w:rPr>
-          <w:rFonts w:ascii="Arial" w:hAnsi="Arial" w:cs="Arial"/>
-        </w:rPr>
-        <w:t xml:space="preserve">rivado, </w:t>
-      </w:r>
-      <w:r>
-        <w:rPr>
-          <w:rFonts w:ascii="Arial" w:hAnsi="Arial" w:cs="Arial"/>
-        </w:rPr>
-        <w:t>Aposentado/</w:t>
-      </w:r>
-      <w:r>
-        <w:rPr>
-          <w:rFonts w:ascii="Arial" w:hAnsi="Arial" w:cs="Arial"/>
-        </w:rPr>
-        <w:t>P</w:t>
-      </w:r>
-      <w:r>
-        <w:rPr>
-          <w:rFonts w:ascii="Arial" w:hAnsi="Arial" w:cs="Arial"/>
-        </w:rPr>
-        <w:t>ensionista</w:t>
+      <w:r>
+        <w:rPr>
+          <w:rFonts w:ascii="Arial" w:hAnsi="Arial" w:cs="Arial"/>
+        </w:rPr>
+        <w:t>Trabalho eventual/</w:t>
+      </w:r>
+      <w:r>
+        <w:rPr>
+          <w:rFonts w:ascii="Arial" w:hAnsi="Arial" w:cs="Arial"/>
+        </w:rPr>
+        <w:t>I</w:t>
+      </w:r>
+      <w:r>
+        <w:rPr>
+          <w:rFonts w:ascii="Arial" w:hAnsi="Arial" w:cs="Arial"/>
+        </w:rPr>
+        <w:t>nformal</w:t>
+      </w:r>
+      <w:r>
+        <w:rPr>
+          <w:rFonts w:ascii="Arial" w:hAnsi="Arial" w:cs="Arial"/>
+        </w:rPr>
+        <w:t>, Trabalhador doméstico, Desempregado, Outro)</w:t>
+      </w:r>
+    </w:p>
+    <w:p>
+      <w:pPr>
+        <w:pStyle w:val="PargrafodaLista"/>
+        <w:numPr>
+          <w:ilvl w:val="0"/>
+          <w:numId w:val="2"/>
+        </w:numPr>
+        <w:jc w:val="both"/>
+        <w:rPr>
+          <w:rFonts w:ascii="Arial" w:hAnsi="Arial" w:cs="Arial"/>
+        </w:rPr>
+      </w:pPr>
+      <w:r>
+        <w:rPr>
+          <w:rFonts w:ascii="Arial" w:hAnsi="Arial" w:cs="Arial"/>
+        </w:rPr>
+        <w:t xml:space="preserve">beneficio_social – (Aposentadoria, Aposentadoria por invalidez, Programa banco da mulher, Tarifa Social, Bolsa Família, </w:t>
+      </w:r>
+      <w:r>
+        <w:rPr>
+          <w:rFonts w:ascii="Arial" w:hAnsi="Arial" w:cs="Arial"/>
+        </w:rPr>
+        <w:t>BPC/LOAS</w:t>
       </w:r>
       <w:r>
         <w:rPr>
@@ -888,120 +647,82 @@
         <w:rPr>
           <w:rFonts w:ascii="Arial" w:hAnsi="Arial" w:cs="Arial"/>
         </w:rPr>
-        <w:t>Trabalho eventual/</w:t>
-      </w:r>
-      <w:r>
-        <w:rPr>
-          <w:rFonts w:ascii="Arial" w:hAnsi="Arial" w:cs="Arial"/>
-        </w:rPr>
-        <w:t>I</w:t>
-      </w:r>
-      <w:r>
-        <w:rPr>
-          <w:rFonts w:ascii="Arial" w:hAnsi="Arial" w:cs="Arial"/>
-        </w:rPr>
-        <w:t>nformal</w:t>
-      </w:r>
-      <w:r>
-        <w:rPr>
-          <w:rFonts w:ascii="Arial" w:hAnsi="Arial" w:cs="Arial"/>
-        </w:rPr>
-        <w:t>, Trabalhador doméstico, Desempregado, Outro)</w:t>
-      </w:r>
-    </w:p>
-    <w:p>
-      <w:pPr>
-        <w:pStyle w:val="PargrafodaLista"/>
-        <w:numPr>
-          <w:ilvl w:val="0"/>
-          <w:numId w:val="2"/>
-        </w:numPr>
-        <w:jc w:val="both"/>
-        <w:rPr>
-          <w:rFonts w:ascii="Arial" w:hAnsi="Arial" w:cs="Arial"/>
-        </w:rPr>
-      </w:pPr>
-      <w:proofErr w:type="spellStart"/>
-      <w:r>
-        <w:rPr>
-          <w:rFonts w:ascii="Arial" w:hAnsi="Arial" w:cs="Arial"/>
-        </w:rPr>
-        <w:t>observacoes</w:t>
-      </w:r>
-      <w:proofErr w:type="spellEnd"/>
-      <w:r>
-        <w:rPr>
-          <w:rFonts w:ascii="Arial" w:hAnsi="Arial" w:cs="Arial"/>
-        </w:rPr>
-        <w:t xml:space="preserve"> – texto</w:t>
-      </w:r>
-    </w:p>
-    <w:p>
-      <w:pPr>
-        <w:pStyle w:val="PargrafodaLista"/>
-        <w:numPr>
-          <w:ilvl w:val="0"/>
-          <w:numId w:val="2"/>
-        </w:numPr>
-        <w:jc w:val="both"/>
-        <w:rPr>
-          <w:rFonts w:ascii="Arial" w:hAnsi="Arial" w:cs="Arial"/>
-        </w:rPr>
-      </w:pPr>
-      <w:proofErr w:type="spellStart"/>
-      <w:r>
-        <w:rPr>
-          <w:rFonts w:ascii="Arial" w:hAnsi="Arial" w:cs="Arial"/>
-        </w:rPr>
-        <w:t>comprovante_de_residencia</w:t>
-      </w:r>
-      <w:proofErr w:type="spellEnd"/>
-      <w:r>
-        <w:rPr>
-          <w:rFonts w:ascii="Arial" w:hAnsi="Arial" w:cs="Arial"/>
-        </w:rPr>
-        <w:t xml:space="preserve"> – </w:t>
-      </w:r>
-      <w:proofErr w:type="spellStart"/>
-      <w:r>
-        <w:rPr>
-          <w:rFonts w:ascii="Arial" w:hAnsi="Arial" w:cs="Arial"/>
-        </w:rPr>
-        <w:t>caracter</w:t>
-      </w:r>
-      <w:proofErr w:type="spellEnd"/>
-      <w:r>
-        <w:rPr>
-          <w:rFonts w:ascii="Arial" w:hAnsi="Arial" w:cs="Arial"/>
-        </w:rPr>
-        <w:t xml:space="preserve"> (255)</w:t>
-      </w:r>
-    </w:p>
-    <w:p>
-      <w:pPr>
-        <w:pStyle w:val="PargrafodaLista"/>
-        <w:numPr>
-          <w:ilvl w:val="0"/>
-          <w:numId w:val="2"/>
-        </w:numPr>
-        <w:jc w:val="both"/>
-        <w:rPr>
-          <w:rFonts w:ascii="Arial" w:hAnsi="Arial" w:cs="Arial"/>
-        </w:rPr>
-      </w:pPr>
-      <w:proofErr w:type="spellStart"/>
-      <w:r>
-        <w:rPr>
-          <w:rFonts w:ascii="Arial" w:hAnsi="Arial" w:cs="Arial"/>
-        </w:rPr>
-        <w:t>endereco_validado</w:t>
-      </w:r>
-      <w:proofErr w:type="spellEnd"/>
-      <w:r>
-        <w:rPr>
-          <w:rFonts w:ascii="Arial" w:hAnsi="Arial" w:cs="Arial"/>
-        </w:rPr>
-        <w:t xml:space="preserve"> – booleano (Sim/Não)</w:t>
+        <w:t>Pensão</w:t>
+      </w:r>
+      <w:r>
+        <w:rPr>
+          <w:rFonts w:ascii="Arial" w:hAnsi="Arial" w:cs="Arial"/>
+        </w:rPr>
+        <w:t xml:space="preserve">, </w:t>
+      </w:r>
+      <w:r>
+        <w:rPr>
+          <w:rFonts w:ascii="Arial" w:hAnsi="Arial" w:cs="Arial"/>
+        </w:rPr>
+        <w:t>Auxílio doença</w:t>
+      </w:r>
+      <w:r>
+        <w:rPr>
+          <w:rFonts w:ascii="Arial" w:hAnsi="Arial" w:cs="Arial"/>
+        </w:rPr>
+        <w:t>)</w:t>
+      </w:r>
+    </w:p>
+    <w:p>
+      <w:pPr>
+        <w:pStyle w:val="PargrafodaLista"/>
+        <w:numPr>
+          <w:ilvl w:val="0"/>
+          <w:numId w:val="2"/>
+        </w:numPr>
+        <w:jc w:val="both"/>
+        <w:rPr>
+          <w:rFonts w:ascii="Arial" w:hAnsi="Arial" w:cs="Arial"/>
+        </w:rPr>
+      </w:pPr>
+      <w:r>
+        <w:rPr>
+          <w:rFonts w:ascii="Arial" w:hAnsi="Arial" w:cs="Arial"/>
+        </w:rPr>
+        <w:t>observacoes – texto</w:t>
+      </w:r>
+    </w:p>
+    <w:p>
+      <w:pPr>
+        <w:pStyle w:val="PargrafodaLista"/>
+        <w:numPr>
+          <w:ilvl w:val="0"/>
+          <w:numId w:val="2"/>
+        </w:numPr>
+        <w:jc w:val="both"/>
+        <w:rPr>
+          <w:rFonts w:ascii="Arial" w:hAnsi="Arial" w:cs="Arial"/>
+        </w:rPr>
+      </w:pPr>
+      <w:r>
+        <w:rPr>
+          <w:rFonts w:ascii="Arial" w:hAnsi="Arial" w:cs="Arial"/>
+        </w:rPr>
+        <w:t>comprovante_de_residencia – caracter (255)</w:t>
+      </w:r>
+    </w:p>
+    <w:p>
+      <w:pPr>
+        <w:pStyle w:val="PargrafodaLista"/>
+        <w:numPr>
+          <w:ilvl w:val="0"/>
+          <w:numId w:val="2"/>
+        </w:numPr>
+        <w:jc w:val="both"/>
+        <w:rPr>
+          <w:rFonts w:ascii="Arial" w:hAnsi="Arial" w:cs="Arial"/>
+        </w:rPr>
+      </w:pPr>
+      <w:r>
+        <w:rPr>
+          <w:rFonts w:ascii="Arial" w:hAnsi="Arial" w:cs="Arial"/>
+        </w:rPr>
+        <w:t>endereco_validado – booleano (Sim/Não)</w:t>
       </w:r>
     </w:p>
     <w:sectPr>
@@ -1854,7 +1575,6 @@
   <w:style w:type="character" w:default="1" w:styleId="Fontepargpadro">
     <w:name w:val="Default Paragraph Font"/>
     <w:uiPriority w:val="1"/>
-    <w:semiHidden/>
     <w:unhideWhenUsed/>
   </w:style>
   <w:style w:type="table" w:default="1" w:styleId="Tabelanormal">

</xml_diff>

<commit_message>
feat: Adiciona coluna autorizacao_responsavel
</commit_message>
<xml_diff>
--- a/Campos das tabelas do banco de dados.docx
+++ b/Campos das tabelas do banco de dados.docx
@@ -55,11 +55,19 @@
           <w:rFonts w:ascii="Arial" w:hAnsi="Arial" w:cs="Arial"/>
         </w:rPr>
       </w:pPr>
-      <w:r>
-        <w:rPr>
-          <w:rFonts w:ascii="Arial" w:hAnsi="Arial" w:cs="Arial"/>
-        </w:rPr>
-        <w:t>banco_talentos:</w:t>
+      <w:proofErr w:type="spellStart"/>
+      <w:r>
+        <w:rPr>
+          <w:rFonts w:ascii="Arial" w:hAnsi="Arial" w:cs="Arial"/>
+        </w:rPr>
+        <w:t>banco_talentos</w:t>
+      </w:r>
+      <w:proofErr w:type="spellEnd"/>
+      <w:r>
+        <w:rPr>
+          <w:rFonts w:ascii="Arial" w:hAnsi="Arial" w:cs="Arial"/>
+        </w:rPr>
+        <w:t>:</w:t>
       </w:r>
     </w:p>
     <w:p>
@@ -97,102 +105,190 @@
         <w:rPr>
           <w:rFonts w:ascii="Arial" w:hAnsi="Arial" w:cs="Arial"/>
         </w:rPr>
-        <w:t>nome – caracter (255)</w:t>
-      </w:r>
-    </w:p>
-    <w:p>
-      <w:pPr>
-        <w:pStyle w:val="PargrafodaLista"/>
-        <w:numPr>
-          <w:ilvl w:val="0"/>
-          <w:numId w:val="2"/>
-        </w:numPr>
-        <w:jc w:val="both"/>
-        <w:rPr>
-          <w:rFonts w:ascii="Arial" w:hAnsi="Arial" w:cs="Arial"/>
-        </w:rPr>
-      </w:pPr>
-      <w:r>
-        <w:rPr>
-          <w:rFonts w:ascii="Arial" w:hAnsi="Arial" w:cs="Arial"/>
-        </w:rPr>
-        <w:t>data_nascimento – data</w:t>
-      </w:r>
-    </w:p>
-    <w:p>
-      <w:pPr>
-        <w:pStyle w:val="PargrafodaLista"/>
-        <w:numPr>
-          <w:ilvl w:val="0"/>
-          <w:numId w:val="2"/>
-        </w:numPr>
-        <w:jc w:val="both"/>
-        <w:rPr>
-          <w:rFonts w:ascii="Arial" w:hAnsi="Arial" w:cs="Arial"/>
-        </w:rPr>
-      </w:pPr>
-      <w:r>
-        <w:rPr>
-          <w:rFonts w:ascii="Arial" w:hAnsi="Arial" w:cs="Arial"/>
-        </w:rPr>
-        <w:t>email – caracter (190)</w:t>
-      </w:r>
-    </w:p>
-    <w:p>
-      <w:pPr>
-        <w:pStyle w:val="PargrafodaLista"/>
-        <w:numPr>
-          <w:ilvl w:val="0"/>
-          <w:numId w:val="2"/>
-        </w:numPr>
-        <w:jc w:val="both"/>
-        <w:rPr>
-          <w:rFonts w:ascii="Arial" w:hAnsi="Arial" w:cs="Arial"/>
-        </w:rPr>
-      </w:pPr>
-      <w:r>
-        <w:rPr>
-          <w:rFonts w:ascii="Arial" w:hAnsi="Arial" w:cs="Arial"/>
-        </w:rPr>
-        <w:t>telefone – caracter (20)</w:t>
-      </w:r>
-    </w:p>
-    <w:p>
-      <w:pPr>
-        <w:pStyle w:val="PargrafodaLista"/>
-        <w:numPr>
-          <w:ilvl w:val="0"/>
-          <w:numId w:val="2"/>
-        </w:numPr>
-        <w:jc w:val="both"/>
-        <w:rPr>
-          <w:rFonts w:ascii="Arial" w:hAnsi="Arial" w:cs="Arial"/>
-        </w:rPr>
-      </w:pPr>
-      <w:r>
-        <w:rPr>
-          <w:rFonts w:ascii="Arial" w:hAnsi="Arial" w:cs="Arial"/>
-        </w:rPr>
-        <w:t>cpf – caracter (14)</w:t>
-      </w:r>
-    </w:p>
-    <w:p>
-      <w:pPr>
-        <w:pStyle w:val="PargrafodaLista"/>
-        <w:numPr>
-          <w:ilvl w:val="0"/>
-          <w:numId w:val="2"/>
-        </w:numPr>
-        <w:jc w:val="both"/>
-        <w:rPr>
-          <w:rFonts w:ascii="Arial" w:hAnsi="Arial" w:cs="Arial"/>
-        </w:rPr>
-      </w:pPr>
-      <w:r>
-        <w:rPr>
-          <w:rFonts w:ascii="Arial" w:hAnsi="Arial" w:cs="Arial"/>
-        </w:rPr>
-        <w:t>renda_mesal – decimal (12,2)</w:t>
+        <w:t xml:space="preserve">nome – </w:t>
+      </w:r>
+      <w:proofErr w:type="spellStart"/>
+      <w:r>
+        <w:rPr>
+          <w:rFonts w:ascii="Arial" w:hAnsi="Arial" w:cs="Arial"/>
+        </w:rPr>
+        <w:t>caracter</w:t>
+      </w:r>
+      <w:proofErr w:type="spellEnd"/>
+      <w:r>
+        <w:rPr>
+          <w:rFonts w:ascii="Arial" w:hAnsi="Arial" w:cs="Arial"/>
+        </w:rPr>
+        <w:t xml:space="preserve"> (255)</w:t>
+      </w:r>
+    </w:p>
+    <w:p>
+      <w:pPr>
+        <w:pStyle w:val="PargrafodaLista"/>
+        <w:numPr>
+          <w:ilvl w:val="0"/>
+          <w:numId w:val="2"/>
+        </w:numPr>
+        <w:jc w:val="both"/>
+        <w:rPr>
+          <w:rFonts w:ascii="Arial" w:hAnsi="Arial" w:cs="Arial"/>
+        </w:rPr>
+      </w:pPr>
+      <w:proofErr w:type="spellStart"/>
+      <w:r>
+        <w:rPr>
+          <w:rFonts w:ascii="Arial" w:hAnsi="Arial" w:cs="Arial"/>
+        </w:rPr>
+        <w:t>data_nascimento</w:t>
+      </w:r>
+      <w:proofErr w:type="spellEnd"/>
+      <w:r>
+        <w:rPr>
+          <w:rFonts w:ascii="Arial" w:hAnsi="Arial" w:cs="Arial"/>
+        </w:rPr>
+        <w:t xml:space="preserve"> – data</w:t>
+      </w:r>
+    </w:p>
+    <w:p>
+      <w:pPr>
+        <w:pStyle w:val="PargrafodaLista"/>
+        <w:numPr>
+          <w:ilvl w:val="0"/>
+          <w:numId w:val="2"/>
+        </w:numPr>
+        <w:jc w:val="both"/>
+        <w:rPr>
+          <w:rFonts w:ascii="Arial" w:hAnsi="Arial" w:cs="Arial"/>
+        </w:rPr>
+      </w:pPr>
+      <w:proofErr w:type="spellStart"/>
+      <w:r>
+        <w:rPr>
+          <w:rFonts w:ascii="Arial" w:hAnsi="Arial" w:cs="Arial"/>
+        </w:rPr>
+        <w:t>email</w:t>
+      </w:r>
+      <w:proofErr w:type="spellEnd"/>
+      <w:r>
+        <w:rPr>
+          <w:rFonts w:ascii="Arial" w:hAnsi="Arial" w:cs="Arial"/>
+        </w:rPr>
+        <w:t xml:space="preserve"> – </w:t>
+      </w:r>
+      <w:proofErr w:type="spellStart"/>
+      <w:r>
+        <w:rPr>
+          <w:rFonts w:ascii="Arial" w:hAnsi="Arial" w:cs="Arial"/>
+        </w:rPr>
+        <w:t>caracter</w:t>
+      </w:r>
+      <w:proofErr w:type="spellEnd"/>
+      <w:r>
+        <w:rPr>
+          <w:rFonts w:ascii="Arial" w:hAnsi="Arial" w:cs="Arial"/>
+        </w:rPr>
+        <w:t xml:space="preserve"> (190)</w:t>
+      </w:r>
+    </w:p>
+    <w:p>
+      <w:pPr>
+        <w:pStyle w:val="PargrafodaLista"/>
+        <w:numPr>
+          <w:ilvl w:val="0"/>
+          <w:numId w:val="2"/>
+        </w:numPr>
+        <w:jc w:val="both"/>
+        <w:rPr>
+          <w:rFonts w:ascii="Arial" w:hAnsi="Arial" w:cs="Arial"/>
+        </w:rPr>
+      </w:pPr>
+      <w:r>
+        <w:rPr>
+          <w:rFonts w:ascii="Arial" w:hAnsi="Arial" w:cs="Arial"/>
+        </w:rPr>
+        <w:t xml:space="preserve">telefone – </w:t>
+      </w:r>
+      <w:proofErr w:type="spellStart"/>
+      <w:r>
+        <w:rPr>
+          <w:rFonts w:ascii="Arial" w:hAnsi="Arial" w:cs="Arial"/>
+        </w:rPr>
+        <w:t>caracter</w:t>
+      </w:r>
+      <w:proofErr w:type="spellEnd"/>
+      <w:r>
+        <w:rPr>
+          <w:rFonts w:ascii="Arial" w:hAnsi="Arial" w:cs="Arial"/>
+        </w:rPr>
+        <w:t xml:space="preserve"> (20)</w:t>
+      </w:r>
+    </w:p>
+    <w:p>
+      <w:pPr>
+        <w:pStyle w:val="PargrafodaLista"/>
+        <w:numPr>
+          <w:ilvl w:val="0"/>
+          <w:numId w:val="2"/>
+        </w:numPr>
+        <w:jc w:val="both"/>
+        <w:rPr>
+          <w:rFonts w:ascii="Arial" w:hAnsi="Arial" w:cs="Arial"/>
+        </w:rPr>
+      </w:pPr>
+      <w:proofErr w:type="spellStart"/>
+      <w:r>
+        <w:rPr>
+          <w:rFonts w:ascii="Arial" w:hAnsi="Arial" w:cs="Arial"/>
+        </w:rPr>
+        <w:t>cpf</w:t>
+      </w:r>
+      <w:proofErr w:type="spellEnd"/>
+      <w:r>
+        <w:rPr>
+          <w:rFonts w:ascii="Arial" w:hAnsi="Arial" w:cs="Arial"/>
+        </w:rPr>
+        <w:t xml:space="preserve"> – </w:t>
+      </w:r>
+      <w:proofErr w:type="spellStart"/>
+      <w:r>
+        <w:rPr>
+          <w:rFonts w:ascii="Arial" w:hAnsi="Arial" w:cs="Arial"/>
+        </w:rPr>
+        <w:t>caracter</w:t>
+      </w:r>
+      <w:proofErr w:type="spellEnd"/>
+      <w:r>
+        <w:rPr>
+          <w:rFonts w:ascii="Arial" w:hAnsi="Arial" w:cs="Arial"/>
+        </w:rPr>
+        <w:t xml:space="preserve"> (14)</w:t>
+      </w:r>
+    </w:p>
+    <w:p>
+      <w:pPr>
+        <w:pStyle w:val="PargrafodaLista"/>
+        <w:numPr>
+          <w:ilvl w:val="0"/>
+          <w:numId w:val="2"/>
+        </w:numPr>
+        <w:jc w:val="both"/>
+        <w:rPr>
+          <w:rFonts w:ascii="Arial" w:hAnsi="Arial" w:cs="Arial"/>
+        </w:rPr>
+      </w:pPr>
+      <w:proofErr w:type="spellStart"/>
+      <w:r>
+        <w:rPr>
+          <w:rFonts w:ascii="Arial" w:hAnsi="Arial" w:cs="Arial"/>
+        </w:rPr>
+        <w:t>renda_mesal</w:t>
+      </w:r>
+      <w:proofErr w:type="spellEnd"/>
+      <w:r>
+        <w:rPr>
+          <w:rFonts w:ascii="Arial" w:hAnsi="Arial" w:cs="Arial"/>
+        </w:rPr>
+        <w:t xml:space="preserve"> – decimal (12,2)</w:t>
       </w:r>
     </w:p>
     <w:p>
@@ -232,49 +328,87 @@
           <w:rFonts w:ascii="Arial" w:hAnsi="Arial" w:cs="Arial"/>
         </w:rPr>
       </w:pPr>
-      <w:r>
-        <w:rPr>
-          <w:rFonts w:ascii="Arial" w:hAnsi="Arial" w:cs="Arial"/>
-        </w:rPr>
-        <w:t>cor_raca – (Branco, Pardo, Preto, Amarelo, Indígena)</w:t>
-      </w:r>
-    </w:p>
-    <w:p>
-      <w:pPr>
-        <w:pStyle w:val="PargrafodaLista"/>
-        <w:numPr>
-          <w:ilvl w:val="0"/>
-          <w:numId w:val="2"/>
-        </w:numPr>
-        <w:jc w:val="both"/>
-        <w:rPr>
-          <w:rFonts w:ascii="Arial" w:hAnsi="Arial" w:cs="Arial"/>
-        </w:rPr>
-      </w:pPr>
-      <w:r>
-        <w:rPr>
-          <w:rFonts w:ascii="Arial" w:hAnsi="Arial" w:cs="Arial"/>
-        </w:rPr>
-        <w:t>estado_civil – (Solteiro, Casado, Separado, Divorciado, Viúvo)</w:t>
-      </w:r>
-    </w:p>
-    <w:p>
-      <w:pPr>
-        <w:pStyle w:val="PargrafodaLista"/>
-        <w:numPr>
-          <w:ilvl w:val="0"/>
-          <w:numId w:val="2"/>
-        </w:numPr>
-        <w:jc w:val="both"/>
-        <w:rPr>
-          <w:rFonts w:ascii="Arial" w:hAnsi="Arial" w:cs="Arial"/>
-        </w:rPr>
-      </w:pPr>
-      <w:r>
-        <w:rPr>
-          <w:rFonts w:ascii="Arial" w:hAnsi="Arial" w:cs="Arial"/>
-        </w:rPr>
-        <w:t>comunidade_tradicional – (Povos Indígenas, Comunidade Quilombola, Povos de Terreiro, Povo Cigano, Pescador Artesanal, Marisqueiro, Ribeirinho, Extravista, Catador de Material Reciclável, Outro)</w:t>
+      <w:proofErr w:type="spellStart"/>
+      <w:r>
+        <w:rPr>
+          <w:rFonts w:ascii="Arial" w:hAnsi="Arial" w:cs="Arial"/>
+        </w:rPr>
+        <w:t>cor_raca</w:t>
+      </w:r>
+      <w:proofErr w:type="spellEnd"/>
+      <w:r>
+        <w:rPr>
+          <w:rFonts w:ascii="Arial" w:hAnsi="Arial" w:cs="Arial"/>
+        </w:rPr>
+        <w:t xml:space="preserve"> – (Branco, Pardo, Preto, Amarelo, Indígena)</w:t>
+      </w:r>
+    </w:p>
+    <w:p>
+      <w:pPr>
+        <w:pStyle w:val="PargrafodaLista"/>
+        <w:numPr>
+          <w:ilvl w:val="0"/>
+          <w:numId w:val="2"/>
+        </w:numPr>
+        <w:jc w:val="both"/>
+        <w:rPr>
+          <w:rFonts w:ascii="Arial" w:hAnsi="Arial" w:cs="Arial"/>
+        </w:rPr>
+      </w:pPr>
+      <w:proofErr w:type="spellStart"/>
+      <w:r>
+        <w:rPr>
+          <w:rFonts w:ascii="Arial" w:hAnsi="Arial" w:cs="Arial"/>
+        </w:rPr>
+        <w:t>estado_civil</w:t>
+      </w:r>
+      <w:proofErr w:type="spellEnd"/>
+      <w:r>
+        <w:rPr>
+          <w:rFonts w:ascii="Arial" w:hAnsi="Arial" w:cs="Arial"/>
+        </w:rPr>
+        <w:t xml:space="preserve"> – (Solteiro, Casado, Separado, Divorciado, Viúvo)</w:t>
+      </w:r>
+    </w:p>
+    <w:p>
+      <w:pPr>
+        <w:pStyle w:val="PargrafodaLista"/>
+        <w:numPr>
+          <w:ilvl w:val="0"/>
+          <w:numId w:val="2"/>
+        </w:numPr>
+        <w:jc w:val="both"/>
+        <w:rPr>
+          <w:rFonts w:ascii="Arial" w:hAnsi="Arial" w:cs="Arial"/>
+        </w:rPr>
+      </w:pPr>
+      <w:proofErr w:type="spellStart"/>
+      <w:r>
+        <w:rPr>
+          <w:rFonts w:ascii="Arial" w:hAnsi="Arial" w:cs="Arial"/>
+        </w:rPr>
+        <w:t>comunidade_tradicional</w:t>
+      </w:r>
+      <w:proofErr w:type="spellEnd"/>
+      <w:r>
+        <w:rPr>
+          <w:rFonts w:ascii="Arial" w:hAnsi="Arial" w:cs="Arial"/>
+        </w:rPr>
+        <w:t xml:space="preserve"> – (Povos Indígenas, Comunidade Quilombola, Povos de Terreiro, Povo Cigano, Pescador Artesanal, Marisqueiro, Ribeirinho, </w:t>
+      </w:r>
+      <w:proofErr w:type="spellStart"/>
+      <w:r>
+        <w:rPr>
+          <w:rFonts w:ascii="Arial" w:hAnsi="Arial" w:cs="Arial"/>
+        </w:rPr>
+        <w:t>Extravista</w:t>
+      </w:r>
+      <w:proofErr w:type="spellEnd"/>
+      <w:r>
+        <w:rPr>
+          <w:rFonts w:ascii="Arial" w:hAnsi="Arial" w:cs="Arial"/>
+        </w:rPr>
+        <w:t>, Catador de Material Reciclável, Outro)</w:t>
       </w:r>
     </w:p>
     <w:p>
@@ -331,26 +465,48 @@
         <w:rPr>
           <w:rFonts w:ascii="Arial" w:hAnsi="Arial" w:cs="Arial"/>
         </w:rPr>
-        <w:t>empreendimento – caracter (255)</w:t>
-      </w:r>
-    </w:p>
-    <w:p>
-      <w:pPr>
-        <w:pStyle w:val="PargrafodaLista"/>
-        <w:numPr>
-          <w:ilvl w:val="0"/>
-          <w:numId w:val="2"/>
-        </w:numPr>
-        <w:jc w:val="both"/>
-        <w:rPr>
-          <w:rFonts w:ascii="Arial" w:hAnsi="Arial" w:cs="Arial"/>
-        </w:rPr>
-      </w:pPr>
-      <w:r>
-        <w:rPr>
-          <w:rFonts w:ascii="Arial" w:hAnsi="Arial" w:cs="Arial"/>
-        </w:rPr>
-        <w:t xml:space="preserve">empresa_regularizada – </w:t>
+        <w:t xml:space="preserve">empreendimento – </w:t>
+      </w:r>
+      <w:proofErr w:type="spellStart"/>
+      <w:r>
+        <w:rPr>
+          <w:rFonts w:ascii="Arial" w:hAnsi="Arial" w:cs="Arial"/>
+        </w:rPr>
+        <w:t>caracter</w:t>
+      </w:r>
+      <w:proofErr w:type="spellEnd"/>
+      <w:r>
+        <w:rPr>
+          <w:rFonts w:ascii="Arial" w:hAnsi="Arial" w:cs="Arial"/>
+        </w:rPr>
+        <w:t xml:space="preserve"> (255)</w:t>
+      </w:r>
+    </w:p>
+    <w:p>
+      <w:pPr>
+        <w:pStyle w:val="PargrafodaLista"/>
+        <w:numPr>
+          <w:ilvl w:val="0"/>
+          <w:numId w:val="2"/>
+        </w:numPr>
+        <w:jc w:val="both"/>
+        <w:rPr>
+          <w:rFonts w:ascii="Arial" w:hAnsi="Arial" w:cs="Arial"/>
+        </w:rPr>
+      </w:pPr>
+      <w:proofErr w:type="spellStart"/>
+      <w:r>
+        <w:rPr>
+          <w:rFonts w:ascii="Arial" w:hAnsi="Arial" w:cs="Arial"/>
+        </w:rPr>
+        <w:t>empresa_regularizada</w:t>
+      </w:r>
+      <w:proofErr w:type="spellEnd"/>
+      <w:r>
+        <w:rPr>
+          <w:rFonts w:ascii="Arial" w:hAnsi="Arial" w:cs="Arial"/>
+        </w:rPr>
+        <w:t xml:space="preserve"> – </w:t>
       </w:r>
       <w:r>
         <w:rPr>
@@ -377,49 +533,101 @@
           <w:rFonts w:ascii="Arial" w:hAnsi="Arial" w:cs="Arial"/>
         </w:rPr>
       </w:pPr>
-      <w:r>
-        <w:rPr>
-          <w:rFonts w:ascii="Arial" w:hAnsi="Arial" w:cs="Arial"/>
-        </w:rPr>
-        <w:t>cnpj – caracter (18)</w:t>
-      </w:r>
-    </w:p>
-    <w:p>
-      <w:pPr>
-        <w:pStyle w:val="PargrafodaLista"/>
-        <w:numPr>
-          <w:ilvl w:val="0"/>
-          <w:numId w:val="2"/>
-        </w:numPr>
-        <w:jc w:val="both"/>
-        <w:rPr>
-          <w:rFonts w:ascii="Arial" w:hAnsi="Arial" w:cs="Arial"/>
-        </w:rPr>
-      </w:pPr>
-      <w:r>
-        <w:rPr>
-          <w:rFonts w:ascii="Arial" w:hAnsi="Arial" w:cs="Arial"/>
-        </w:rPr>
-        <w:t>segmento_atuacao – caracter (50)</w:t>
-      </w:r>
-    </w:p>
-    <w:p>
-      <w:pPr>
-        <w:pStyle w:val="PargrafodaLista"/>
-        <w:numPr>
-          <w:ilvl w:val="0"/>
-          <w:numId w:val="2"/>
-        </w:numPr>
-        <w:jc w:val="both"/>
-        <w:rPr>
-          <w:rFonts w:ascii="Arial" w:hAnsi="Arial" w:cs="Arial"/>
-        </w:rPr>
-      </w:pPr>
-      <w:r>
-        <w:rPr>
-          <w:rFonts w:ascii="Arial" w:hAnsi="Arial" w:cs="Arial"/>
-        </w:rPr>
-        <w:t>empreende_sozinho –</w:t>
+      <w:proofErr w:type="spellStart"/>
+      <w:r>
+        <w:rPr>
+          <w:rFonts w:ascii="Arial" w:hAnsi="Arial" w:cs="Arial"/>
+        </w:rPr>
+        <w:t>cnpj</w:t>
+      </w:r>
+      <w:proofErr w:type="spellEnd"/>
+      <w:r>
+        <w:rPr>
+          <w:rFonts w:ascii="Arial" w:hAnsi="Arial" w:cs="Arial"/>
+        </w:rPr>
+        <w:t xml:space="preserve"> – </w:t>
+      </w:r>
+      <w:proofErr w:type="spellStart"/>
+      <w:r>
+        <w:rPr>
+          <w:rFonts w:ascii="Arial" w:hAnsi="Arial" w:cs="Arial"/>
+        </w:rPr>
+        <w:t>caracter</w:t>
+      </w:r>
+      <w:proofErr w:type="spellEnd"/>
+      <w:r>
+        <w:rPr>
+          <w:rFonts w:ascii="Arial" w:hAnsi="Arial" w:cs="Arial"/>
+        </w:rPr>
+        <w:t xml:space="preserve"> (18)</w:t>
+      </w:r>
+    </w:p>
+    <w:p>
+      <w:pPr>
+        <w:pStyle w:val="PargrafodaLista"/>
+        <w:numPr>
+          <w:ilvl w:val="0"/>
+          <w:numId w:val="2"/>
+        </w:numPr>
+        <w:jc w:val="both"/>
+        <w:rPr>
+          <w:rFonts w:ascii="Arial" w:hAnsi="Arial" w:cs="Arial"/>
+        </w:rPr>
+      </w:pPr>
+      <w:proofErr w:type="spellStart"/>
+      <w:r>
+        <w:rPr>
+          <w:rFonts w:ascii="Arial" w:hAnsi="Arial" w:cs="Arial"/>
+        </w:rPr>
+        <w:t>segmento_atuacao</w:t>
+      </w:r>
+      <w:proofErr w:type="spellEnd"/>
+      <w:r>
+        <w:rPr>
+          <w:rFonts w:ascii="Arial" w:hAnsi="Arial" w:cs="Arial"/>
+        </w:rPr>
+        <w:t xml:space="preserve"> – </w:t>
+      </w:r>
+      <w:proofErr w:type="spellStart"/>
+      <w:r>
+        <w:rPr>
+          <w:rFonts w:ascii="Arial" w:hAnsi="Arial" w:cs="Arial"/>
+        </w:rPr>
+        <w:t>caracter</w:t>
+      </w:r>
+      <w:proofErr w:type="spellEnd"/>
+      <w:r>
+        <w:rPr>
+          <w:rFonts w:ascii="Arial" w:hAnsi="Arial" w:cs="Arial"/>
+        </w:rPr>
+        <w:t xml:space="preserve"> (50)</w:t>
+      </w:r>
+    </w:p>
+    <w:p>
+      <w:pPr>
+        <w:pStyle w:val="PargrafodaLista"/>
+        <w:numPr>
+          <w:ilvl w:val="0"/>
+          <w:numId w:val="2"/>
+        </w:numPr>
+        <w:jc w:val="both"/>
+        <w:rPr>
+          <w:rFonts w:ascii="Arial" w:hAnsi="Arial" w:cs="Arial"/>
+        </w:rPr>
+      </w:pPr>
+      <w:proofErr w:type="spellStart"/>
+      <w:r>
+        <w:rPr>
+          <w:rFonts w:ascii="Arial" w:hAnsi="Arial" w:cs="Arial"/>
+        </w:rPr>
+        <w:t>empreende_sozinho</w:t>
+      </w:r>
+      <w:proofErr w:type="spellEnd"/>
+      <w:r>
+        <w:rPr>
+          <w:rFonts w:ascii="Arial" w:hAnsi="Arial" w:cs="Arial"/>
+        </w:rPr>
+        <w:t xml:space="preserve"> –</w:t>
       </w:r>
       <w:r>
         <w:rPr>
@@ -446,87 +654,155 @@
           <w:rFonts w:ascii="Arial" w:hAnsi="Arial" w:cs="Arial"/>
         </w:rPr>
       </w:pPr>
-      <w:r>
-        <w:rPr>
-          <w:rFonts w:ascii="Arial" w:hAnsi="Arial" w:cs="Arial"/>
-        </w:rPr>
-        <w:t>descrição_empreendimento – texto</w:t>
-      </w:r>
-    </w:p>
-    <w:p>
-      <w:pPr>
-        <w:pStyle w:val="PargrafodaLista"/>
-        <w:numPr>
-          <w:ilvl w:val="0"/>
-          <w:numId w:val="2"/>
-        </w:numPr>
-        <w:jc w:val="both"/>
-        <w:rPr>
-          <w:rFonts w:ascii="Arial" w:hAnsi="Arial" w:cs="Arial"/>
-        </w:rPr>
-      </w:pPr>
-      <w:r>
-        <w:rPr>
-          <w:rFonts w:ascii="Arial" w:hAnsi="Arial" w:cs="Arial"/>
-        </w:rPr>
-        <w:t>tipo_producao – caracter (255)</w:t>
-      </w:r>
-    </w:p>
-    <w:p>
-      <w:pPr>
-        <w:pStyle w:val="PargrafodaLista"/>
-        <w:numPr>
-          <w:ilvl w:val="0"/>
-          <w:numId w:val="2"/>
-        </w:numPr>
-        <w:jc w:val="both"/>
-        <w:rPr>
-          <w:rFonts w:ascii="Arial" w:hAnsi="Arial" w:cs="Arial"/>
-        </w:rPr>
-      </w:pPr>
-      <w:r>
-        <w:rPr>
-          <w:rFonts w:ascii="Arial" w:hAnsi="Arial" w:cs="Arial"/>
-        </w:rPr>
-        <w:t>instagram – caracter (255)</w:t>
-      </w:r>
-    </w:p>
-    <w:p>
-      <w:pPr>
-        <w:pStyle w:val="PargrafodaLista"/>
-        <w:numPr>
-          <w:ilvl w:val="0"/>
-          <w:numId w:val="2"/>
-        </w:numPr>
-        <w:jc w:val="both"/>
-        <w:rPr>
-          <w:rFonts w:ascii="Arial" w:hAnsi="Arial" w:cs="Arial"/>
-        </w:rPr>
-      </w:pPr>
-      <w:r>
-        <w:rPr>
-          <w:rFonts w:ascii="Arial" w:hAnsi="Arial" w:cs="Arial"/>
-        </w:rPr>
-        <w:t>ja_participou – booleano (Sim/Não)</w:t>
-      </w:r>
-    </w:p>
-    <w:p>
-      <w:pPr>
-        <w:pStyle w:val="PargrafodaLista"/>
-        <w:numPr>
-          <w:ilvl w:val="0"/>
-          <w:numId w:val="2"/>
-        </w:numPr>
-        <w:jc w:val="both"/>
-        <w:rPr>
-          <w:rFonts w:ascii="Arial" w:hAnsi="Arial" w:cs="Arial"/>
-        </w:rPr>
-      </w:pPr>
-      <w:r>
-        <w:rPr>
-          <w:rFonts w:ascii="Arial" w:hAnsi="Arial" w:cs="Arial"/>
-        </w:rPr>
-        <w:t xml:space="preserve">situação_profissional – (Autônomo, </w:t>
+      <w:proofErr w:type="spellStart"/>
+      <w:r>
+        <w:rPr>
+          <w:rFonts w:ascii="Arial" w:hAnsi="Arial" w:cs="Arial"/>
+        </w:rPr>
+        <w:t>descrição_empreendimento</w:t>
+      </w:r>
+      <w:proofErr w:type="spellEnd"/>
+      <w:r>
+        <w:rPr>
+          <w:rFonts w:ascii="Arial" w:hAnsi="Arial" w:cs="Arial"/>
+        </w:rPr>
+        <w:t xml:space="preserve"> – texto</w:t>
+      </w:r>
+    </w:p>
+    <w:p>
+      <w:pPr>
+        <w:pStyle w:val="PargrafodaLista"/>
+        <w:numPr>
+          <w:ilvl w:val="0"/>
+          <w:numId w:val="2"/>
+        </w:numPr>
+        <w:jc w:val="both"/>
+        <w:rPr>
+          <w:rFonts w:ascii="Arial" w:hAnsi="Arial" w:cs="Arial"/>
+        </w:rPr>
+      </w:pPr>
+      <w:proofErr w:type="spellStart"/>
+      <w:r>
+        <w:rPr>
+          <w:rFonts w:ascii="Arial" w:hAnsi="Arial" w:cs="Arial"/>
+        </w:rPr>
+        <w:t>tipo_producao</w:t>
+      </w:r>
+      <w:proofErr w:type="spellEnd"/>
+      <w:r>
+        <w:rPr>
+          <w:rFonts w:ascii="Arial" w:hAnsi="Arial" w:cs="Arial"/>
+        </w:rPr>
+        <w:t xml:space="preserve"> – </w:t>
+      </w:r>
+      <w:proofErr w:type="spellStart"/>
+      <w:r>
+        <w:rPr>
+          <w:rFonts w:ascii="Arial" w:hAnsi="Arial" w:cs="Arial"/>
+        </w:rPr>
+        <w:t>caracter</w:t>
+      </w:r>
+      <w:proofErr w:type="spellEnd"/>
+      <w:r>
+        <w:rPr>
+          <w:rFonts w:ascii="Arial" w:hAnsi="Arial" w:cs="Arial"/>
+        </w:rPr>
+        <w:t xml:space="preserve"> (255)</w:t>
+      </w:r>
+    </w:p>
+    <w:p>
+      <w:pPr>
+        <w:pStyle w:val="PargrafodaLista"/>
+        <w:numPr>
+          <w:ilvl w:val="0"/>
+          <w:numId w:val="2"/>
+        </w:numPr>
+        <w:jc w:val="both"/>
+        <w:rPr>
+          <w:rFonts w:ascii="Arial" w:hAnsi="Arial" w:cs="Arial"/>
+        </w:rPr>
+      </w:pPr>
+      <w:proofErr w:type="spellStart"/>
+      <w:r>
+        <w:rPr>
+          <w:rFonts w:ascii="Arial" w:hAnsi="Arial" w:cs="Arial"/>
+        </w:rPr>
+        <w:t>instagram</w:t>
+      </w:r>
+      <w:proofErr w:type="spellEnd"/>
+      <w:r>
+        <w:rPr>
+          <w:rFonts w:ascii="Arial" w:hAnsi="Arial" w:cs="Arial"/>
+        </w:rPr>
+        <w:t xml:space="preserve"> – </w:t>
+      </w:r>
+      <w:proofErr w:type="spellStart"/>
+      <w:r>
+        <w:rPr>
+          <w:rFonts w:ascii="Arial" w:hAnsi="Arial" w:cs="Arial"/>
+        </w:rPr>
+        <w:t>caracter</w:t>
+      </w:r>
+      <w:proofErr w:type="spellEnd"/>
+      <w:r>
+        <w:rPr>
+          <w:rFonts w:ascii="Arial" w:hAnsi="Arial" w:cs="Arial"/>
+        </w:rPr>
+        <w:t xml:space="preserve"> (255)</w:t>
+      </w:r>
+    </w:p>
+    <w:p>
+      <w:pPr>
+        <w:pStyle w:val="PargrafodaLista"/>
+        <w:numPr>
+          <w:ilvl w:val="0"/>
+          <w:numId w:val="2"/>
+        </w:numPr>
+        <w:jc w:val="both"/>
+        <w:rPr>
+          <w:rFonts w:ascii="Arial" w:hAnsi="Arial" w:cs="Arial"/>
+        </w:rPr>
+      </w:pPr>
+      <w:proofErr w:type="spellStart"/>
+      <w:r>
+        <w:rPr>
+          <w:rFonts w:ascii="Arial" w:hAnsi="Arial" w:cs="Arial"/>
+        </w:rPr>
+        <w:t>ja_participou</w:t>
+      </w:r>
+      <w:proofErr w:type="spellEnd"/>
+      <w:r>
+        <w:rPr>
+          <w:rFonts w:ascii="Arial" w:hAnsi="Arial" w:cs="Arial"/>
+        </w:rPr>
+        <w:t xml:space="preserve"> – booleano (Sim/Não)</w:t>
+      </w:r>
+    </w:p>
+    <w:p>
+      <w:pPr>
+        <w:pStyle w:val="PargrafodaLista"/>
+        <w:numPr>
+          <w:ilvl w:val="0"/>
+          <w:numId w:val="2"/>
+        </w:numPr>
+        <w:jc w:val="both"/>
+        <w:rPr>
+          <w:rFonts w:ascii="Arial" w:hAnsi="Arial" w:cs="Arial"/>
+        </w:rPr>
+      </w:pPr>
+      <w:proofErr w:type="spellStart"/>
+      <w:r>
+        <w:rPr>
+          <w:rFonts w:ascii="Arial" w:hAnsi="Arial" w:cs="Arial"/>
+        </w:rPr>
+        <w:t>situação_profissional</w:t>
+      </w:r>
+      <w:proofErr w:type="spellEnd"/>
+      <w:r>
+        <w:rPr>
+          <w:rFonts w:ascii="Arial" w:hAnsi="Arial" w:cs="Arial"/>
+        </w:rPr>
+        <w:t xml:space="preserve"> – (Autônomo, </w:t>
       </w:r>
       <w:r>
         <w:rPr>
@@ -625,11 +901,19 @@
           <w:rFonts w:ascii="Arial" w:hAnsi="Arial" w:cs="Arial"/>
         </w:rPr>
       </w:pPr>
-      <w:r>
-        <w:rPr>
-          <w:rFonts w:ascii="Arial" w:hAnsi="Arial" w:cs="Arial"/>
-        </w:rPr>
-        <w:t xml:space="preserve">beneficio_social – (Aposentadoria, Aposentadoria por invalidez, Programa banco da mulher, Tarifa Social, Bolsa Família, </w:t>
+      <w:proofErr w:type="spellStart"/>
+      <w:r>
+        <w:rPr>
+          <w:rFonts w:ascii="Arial" w:hAnsi="Arial" w:cs="Arial"/>
+        </w:rPr>
+        <w:t>beneficio_social</w:t>
+      </w:r>
+      <w:proofErr w:type="spellEnd"/>
+      <w:r>
+        <w:rPr>
+          <w:rFonts w:ascii="Arial" w:hAnsi="Arial" w:cs="Arial"/>
+        </w:rPr>
+        <w:t xml:space="preserve"> – (Aposentadoria, Aposentadoria por invalidez, Programa banco da mulher, Tarifa Social, Bolsa Família, </w:t>
       </w:r>
       <w:r>
         <w:rPr>
@@ -680,49 +964,128 @@
           <w:rFonts w:ascii="Arial" w:hAnsi="Arial" w:cs="Arial"/>
         </w:rPr>
       </w:pPr>
-      <w:r>
-        <w:rPr>
-          <w:rFonts w:ascii="Arial" w:hAnsi="Arial" w:cs="Arial"/>
-        </w:rPr>
-        <w:t>observacoes – texto</w:t>
-      </w:r>
-    </w:p>
-    <w:p>
-      <w:pPr>
-        <w:pStyle w:val="PargrafodaLista"/>
-        <w:numPr>
-          <w:ilvl w:val="0"/>
-          <w:numId w:val="2"/>
-        </w:numPr>
-        <w:jc w:val="both"/>
-        <w:rPr>
-          <w:rFonts w:ascii="Arial" w:hAnsi="Arial" w:cs="Arial"/>
-        </w:rPr>
-      </w:pPr>
-      <w:r>
-        <w:rPr>
-          <w:rFonts w:ascii="Arial" w:hAnsi="Arial" w:cs="Arial"/>
-        </w:rPr>
-        <w:t>comprovante_de_residencia – caracter (255)</w:t>
-      </w:r>
-    </w:p>
-    <w:p>
-      <w:pPr>
-        <w:pStyle w:val="PargrafodaLista"/>
-        <w:numPr>
-          <w:ilvl w:val="0"/>
-          <w:numId w:val="2"/>
-        </w:numPr>
-        <w:jc w:val="both"/>
-        <w:rPr>
-          <w:rFonts w:ascii="Arial" w:hAnsi="Arial" w:cs="Arial"/>
-        </w:rPr>
-      </w:pPr>
-      <w:r>
-        <w:rPr>
-          <w:rFonts w:ascii="Arial" w:hAnsi="Arial" w:cs="Arial"/>
-        </w:rPr>
-        <w:t>endereco_validado – booleano (Sim/Não)</w:t>
+      <w:proofErr w:type="spellStart"/>
+      <w:r>
+        <w:rPr>
+          <w:rFonts w:ascii="Arial" w:hAnsi="Arial" w:cs="Arial"/>
+        </w:rPr>
+        <w:t>observacoes</w:t>
+      </w:r>
+      <w:proofErr w:type="spellEnd"/>
+      <w:r>
+        <w:rPr>
+          <w:rFonts w:ascii="Arial" w:hAnsi="Arial" w:cs="Arial"/>
+        </w:rPr>
+        <w:t xml:space="preserve"> – texto</w:t>
+      </w:r>
+    </w:p>
+    <w:p>
+      <w:pPr>
+        <w:pStyle w:val="PargrafodaLista"/>
+        <w:numPr>
+          <w:ilvl w:val="0"/>
+          <w:numId w:val="2"/>
+        </w:numPr>
+        <w:jc w:val="both"/>
+        <w:rPr>
+          <w:rFonts w:ascii="Arial" w:hAnsi="Arial" w:cs="Arial"/>
+        </w:rPr>
+      </w:pPr>
+      <w:proofErr w:type="spellStart"/>
+      <w:r>
+        <w:rPr>
+          <w:rFonts w:ascii="Arial" w:hAnsi="Arial" w:cs="Arial"/>
+        </w:rPr>
+        <w:t>comprovante_de_residencia</w:t>
+      </w:r>
+      <w:proofErr w:type="spellEnd"/>
+      <w:r>
+        <w:rPr>
+          <w:rFonts w:ascii="Arial" w:hAnsi="Arial" w:cs="Arial"/>
+        </w:rPr>
+        <w:t xml:space="preserve"> – </w:t>
+      </w:r>
+      <w:proofErr w:type="spellStart"/>
+      <w:r>
+        <w:rPr>
+          <w:rFonts w:ascii="Arial" w:hAnsi="Arial" w:cs="Arial"/>
+        </w:rPr>
+        <w:t>caracter</w:t>
+      </w:r>
+      <w:proofErr w:type="spellEnd"/>
+      <w:r>
+        <w:rPr>
+          <w:rFonts w:ascii="Arial" w:hAnsi="Arial" w:cs="Arial"/>
+        </w:rPr>
+        <w:t xml:space="preserve"> (255)</w:t>
+      </w:r>
+    </w:p>
+    <w:p>
+      <w:pPr>
+        <w:pStyle w:val="PargrafodaLista"/>
+        <w:numPr>
+          <w:ilvl w:val="0"/>
+          <w:numId w:val="2"/>
+        </w:numPr>
+        <w:jc w:val="both"/>
+        <w:rPr>
+          <w:rFonts w:ascii="Arial" w:hAnsi="Arial" w:cs="Arial"/>
+        </w:rPr>
+      </w:pPr>
+      <w:proofErr w:type="spellStart"/>
+      <w:r>
+        <w:rPr>
+          <w:rFonts w:ascii="Arial" w:hAnsi="Arial" w:cs="Arial"/>
+        </w:rPr>
+        <w:t>endereco_validado</w:t>
+      </w:r>
+      <w:proofErr w:type="spellEnd"/>
+      <w:r>
+        <w:rPr>
+          <w:rFonts w:ascii="Arial" w:hAnsi="Arial" w:cs="Arial"/>
+        </w:rPr>
+        <w:t xml:space="preserve"> – booleano (Sim/Não)</w:t>
+      </w:r>
+    </w:p>
+    <w:p>
+      <w:pPr>
+        <w:pStyle w:val="PargrafodaLista"/>
+        <w:numPr>
+          <w:ilvl w:val="0"/>
+          <w:numId w:val="2"/>
+        </w:numPr>
+        <w:jc w:val="both"/>
+        <w:rPr>
+          <w:rFonts w:ascii="Arial" w:hAnsi="Arial" w:cs="Arial"/>
+        </w:rPr>
+      </w:pPr>
+      <w:proofErr w:type="spellStart"/>
+      <w:r>
+        <w:rPr>
+          <w:rFonts w:ascii="Arial" w:hAnsi="Arial" w:cs="Arial"/>
+        </w:rPr>
+        <w:t>autorizacao_responsavel</w:t>
+      </w:r>
+      <w:proofErr w:type="spellEnd"/>
+      <w:r>
+        <w:rPr>
+          <w:rFonts w:ascii="Arial" w:hAnsi="Arial" w:cs="Arial"/>
+        </w:rPr>
+        <w:t xml:space="preserve"> – </w:t>
+      </w:r>
+      <w:proofErr w:type="spellStart"/>
+      <w:r>
+        <w:rPr>
+          <w:rFonts w:ascii="Arial" w:hAnsi="Arial" w:cs="Arial"/>
+        </w:rPr>
+        <w:t>caracter</w:t>
+      </w:r>
+      <w:proofErr w:type="spellEnd"/>
+      <w:r>
+        <w:rPr>
+          <w:rFonts w:ascii="Arial" w:hAnsi="Arial" w:cs="Arial"/>
+        </w:rPr>
+        <w:t xml:space="preserve"> (500)</w:t>
       </w:r>
     </w:p>
     <w:sectPr>
@@ -1575,6 +1938,7 @@
   <w:style w:type="character" w:default="1" w:styleId="Fontepargpadro">
     <w:name w:val="Default Paragraph Font"/>
     <w:uiPriority w:val="1"/>
+    <w:semiHidden/>
     <w:unhideWhenUsed/>
   </w:style>
   <w:style w:type="table" w:default="1" w:styleId="Tabelanormal">

</xml_diff>